<commit_message>
Cleaned and converted all interviews.
</commit_message>
<xml_diff>
--- a/transcripts/Thesis transcript Jon Stephan.docx
+++ b/transcripts/Thesis transcript Jon Stephan.docx
@@ -4,24 +4,24 @@
   <w:body>
     <w:p>
       <w:pPr>
+        <w:pStyle w:val="BlockText"/>
+      </w:pPr>
+      <w:r>
+        <w:t xml:space="preserve">[Me]</w:t>
+      </w:r>
+      <w:r>
+        <w:t xml:space="preserve"> </w:t>
+      </w:r>
+      <w:r>
+        <w:t xml:space="preserve">Hello, how’s it going today?</w:t>
+      </w:r>
+    </w:p>
+    <w:p>
+      <w:pPr>
         <w:pStyle w:val="FirstParagraph"/>
       </w:pPr>
       <w:r>
-        <w:t xml:space="preserve">[Speaker 1]</w:t>
-      </w:r>
-      <w:r>
-        <w:t xml:space="preserve"> </w:t>
-      </w:r>
-      <w:r>
-        <w:t xml:space="preserve">Hello, how’s it going today?</w:t>
-      </w:r>
-    </w:p>
-    <w:p>
-      <w:pPr>
-        <w:pStyle w:val="BodyText"/>
-      </w:pPr>
-      <w:r>
-        <w:t xml:space="preserve">[Speaker 0]</w:t>
+        <w:t xml:space="preserve">[Them]</w:t>
       </w:r>
       <w:r>
         <w:t xml:space="preserve"> </w:t>
@@ -35,7 +35,7 @@
         <w:pStyle w:val="BodyText"/>
       </w:pPr>
       <w:r>
-        <w:t xml:space="preserve">[Speaker 0]</w:t>
+        <w:t xml:space="preserve">[Them]</w:t>
       </w:r>
       <w:r>
         <w:t xml:space="preserve"> </w:t>
@@ -49,7 +49,7 @@
         <w:pStyle w:val="BodyText"/>
       </w:pPr>
       <w:r>
-        <w:t xml:space="preserve">[Speaker 0]</w:t>
+        <w:t xml:space="preserve">[Them]</w:t>
       </w:r>
       <w:r>
         <w:t xml:space="preserve"> </w:t>
@@ -63,7 +63,7 @@
         <w:pStyle w:val="BodyText"/>
       </w:pPr>
       <w:r>
-        <w:t xml:space="preserve">[Speaker 0]</w:t>
+        <w:t xml:space="preserve">[Them]</w:t>
       </w:r>
       <w:r>
         <w:t xml:space="preserve"> </w:t>
@@ -77,7 +77,7 @@
         <w:pStyle w:val="BodyText"/>
       </w:pPr>
       <w:r>
-        <w:t xml:space="preserve">[Speaker 0]</w:t>
+        <w:t xml:space="preserve">[Them]</w:t>
       </w:r>
       <w:r>
         <w:t xml:space="preserve"> </w:t>
@@ -91,7 +91,7 @@
         <w:pStyle w:val="BodyText"/>
       </w:pPr>
       <w:r>
-        <w:t xml:space="preserve">[Speaker 0]</w:t>
+        <w:t xml:space="preserve">[Them]</w:t>
       </w:r>
       <w:r>
         <w:t xml:space="preserve"> </w:t>
@@ -105,7 +105,7 @@
         <w:pStyle w:val="BodyText"/>
       </w:pPr>
       <w:r>
-        <w:t xml:space="preserve">[Speaker 0]</w:t>
+        <w:t xml:space="preserve">[Them]</w:t>
       </w:r>
       <w:r>
         <w:t xml:space="preserve"> </w:t>
@@ -119,7 +119,7 @@
         <w:pStyle w:val="BodyText"/>
       </w:pPr>
       <w:r>
-        <w:t xml:space="preserve">[Speaker 0]</w:t>
+        <w:t xml:space="preserve">[Them]</w:t>
       </w:r>
       <w:r>
         <w:t xml:space="preserve"> </w:t>
@@ -133,7 +133,7 @@
         <w:pStyle w:val="BodyText"/>
       </w:pPr>
       <w:r>
-        <w:t xml:space="preserve">[Speaker 0]</w:t>
+        <w:t xml:space="preserve">[Them]</w:t>
       </w:r>
       <w:r>
         <w:t xml:space="preserve"> </w:t>
@@ -147,7 +147,7 @@
         <w:pStyle w:val="BodyText"/>
       </w:pPr>
       <w:r>
-        <w:t xml:space="preserve">[Speaker 0]</w:t>
+        <w:t xml:space="preserve">[Them]</w:t>
       </w:r>
       <w:r>
         <w:t xml:space="preserve"> </w:t>
@@ -161,7 +161,7 @@
         <w:pStyle w:val="BodyText"/>
       </w:pPr>
       <w:r>
-        <w:t xml:space="preserve">[Speaker 0]</w:t>
+        <w:t xml:space="preserve">[Them]</w:t>
       </w:r>
       <w:r>
         <w:t xml:space="preserve"> </w:t>
@@ -187,7 +187,7 @@
         <w:pStyle w:val="BodyText"/>
       </w:pPr>
       <w:r>
-        <w:t xml:space="preserve">[Speaker 0]</w:t>
+        <w:t xml:space="preserve">[Them]</w:t>
       </w:r>
       <w:r>
         <w:t xml:space="preserve"> </w:t>
@@ -225,7 +225,7 @@
         <w:pStyle w:val="BodyText"/>
       </w:pPr>
       <w:r>
-        <w:t xml:space="preserve">[Speaker 0]</w:t>
+        <w:t xml:space="preserve">[Them]</w:t>
       </w:r>
       <w:r>
         <w:t xml:space="preserve"> </w:t>
@@ -239,7 +239,7 @@
         <w:pStyle w:val="BodyText"/>
       </w:pPr>
       <w:r>
-        <w:t xml:space="preserve">[Speaker 0]</w:t>
+        <w:t xml:space="preserve">[Them]</w:t>
       </w:r>
       <w:r>
         <w:t xml:space="preserve"> </w:t>
@@ -265,7 +265,7 @@
         <w:pStyle w:val="BodyText"/>
       </w:pPr>
       <w:r>
-        <w:t xml:space="preserve">[Speaker 0]</w:t>
+        <w:t xml:space="preserve">[Them]</w:t>
       </w:r>
       <w:r>
         <w:t xml:space="preserve"> </w:t>
@@ -279,7 +279,7 @@
         <w:pStyle w:val="BodyText"/>
       </w:pPr>
       <w:r>
-        <w:t xml:space="preserve">[Speaker 0]</w:t>
+        <w:t xml:space="preserve">[Them]</w:t>
       </w:r>
       <w:r>
         <w:t xml:space="preserve"> </w:t>
@@ -293,7 +293,7 @@
         <w:pStyle w:val="BodyText"/>
       </w:pPr>
       <w:r>
-        <w:t xml:space="preserve">[Speaker 0]</w:t>
+        <w:t xml:space="preserve">[Them]</w:t>
       </w:r>
       <w:r>
         <w:t xml:space="preserve"> </w:t>
@@ -319,7 +319,7 @@
         <w:pStyle w:val="BodyText"/>
       </w:pPr>
       <w:r>
-        <w:t xml:space="preserve">[Speaker 0]</w:t>
+        <w:t xml:space="preserve">[Them]</w:t>
       </w:r>
       <w:r>
         <w:t xml:space="preserve"> </w:t>
@@ -333,7 +333,7 @@
         <w:pStyle w:val="BodyText"/>
       </w:pPr>
       <w:r>
-        <w:t xml:space="preserve">[Speaker 0]</w:t>
+        <w:t xml:space="preserve">[Them]</w:t>
       </w:r>
       <w:r>
         <w:t xml:space="preserve"> </w:t>
@@ -347,7 +347,7 @@
         <w:pStyle w:val="BodyText"/>
       </w:pPr>
       <w:r>
-        <w:t xml:space="preserve">[Speaker 0]</w:t>
+        <w:t xml:space="preserve">[Them]</w:t>
       </w:r>
       <w:r>
         <w:t xml:space="preserve"> </w:t>
@@ -361,7 +361,7 @@
         <w:pStyle w:val="BodyText"/>
       </w:pPr>
       <w:r>
-        <w:t xml:space="preserve">[Speaker 0]</w:t>
+        <w:t xml:space="preserve">[Them]</w:t>
       </w:r>
       <w:r>
         <w:t xml:space="preserve"> </w:t>
@@ -375,7 +375,7 @@
         <w:pStyle w:val="BodyText"/>
       </w:pPr>
       <w:r>
-        <w:t xml:space="preserve">[Speaker 0]</w:t>
+        <w:t xml:space="preserve">[Them]</w:t>
       </w:r>
       <w:r>
         <w:t xml:space="preserve"> </w:t>
@@ -389,7 +389,7 @@
         <w:pStyle w:val="BodyText"/>
       </w:pPr>
       <w:r>
-        <w:t xml:space="preserve">[Speaker 0]</w:t>
+        <w:t xml:space="preserve">[Them]</w:t>
       </w:r>
       <w:r>
         <w:t xml:space="preserve"> </w:t>
@@ -403,7 +403,7 @@
         <w:pStyle w:val="BodyText"/>
       </w:pPr>
       <w:r>
-        <w:t xml:space="preserve">[Speaker 0]</w:t>
+        <w:t xml:space="preserve">[Them]</w:t>
       </w:r>
       <w:r>
         <w:t xml:space="preserve"> </w:t>
@@ -417,7 +417,7 @@
         <w:pStyle w:val="BodyText"/>
       </w:pPr>
       <w:r>
-        <w:t xml:space="preserve">[Speaker 0]</w:t>
+        <w:t xml:space="preserve">[Them]</w:t>
       </w:r>
       <w:r>
         <w:t xml:space="preserve"> </w:t>
@@ -431,7 +431,7 @@
         <w:pStyle w:val="BodyText"/>
       </w:pPr>
       <w:r>
-        <w:t xml:space="preserve">[Speaker 0]</w:t>
+        <w:t xml:space="preserve">[Them]</w:t>
       </w:r>
       <w:r>
         <w:t xml:space="preserve"> </w:t>
@@ -445,7 +445,7 @@
         <w:pStyle w:val="BodyText"/>
       </w:pPr>
       <w:r>
-        <w:t xml:space="preserve">[Speaker 0]</w:t>
+        <w:t xml:space="preserve">[Them]</w:t>
       </w:r>
       <w:r>
         <w:t xml:space="preserve"> </w:t>
@@ -459,7 +459,7 @@
         <w:pStyle w:val="BodyText"/>
       </w:pPr>
       <w:r>
-        <w:t xml:space="preserve">[Speaker 0]</w:t>
+        <w:t xml:space="preserve">[Them]</w:t>
       </w:r>
       <w:r>
         <w:t xml:space="preserve"> </w:t>
@@ -473,7 +473,7 @@
         <w:pStyle w:val="BodyText"/>
       </w:pPr>
       <w:r>
-        <w:t xml:space="preserve">[Speaker 0]</w:t>
+        <w:t xml:space="preserve">[Them]</w:t>
       </w:r>
       <w:r>
         <w:t xml:space="preserve"> </w:t>
@@ -487,7 +487,7 @@
         <w:pStyle w:val="BodyText"/>
       </w:pPr>
       <w:r>
-        <w:t xml:space="preserve">[Speaker 0]</w:t>
+        <w:t xml:space="preserve">[Them]</w:t>
       </w:r>
       <w:r>
         <w:t xml:space="preserve"> </w:t>
@@ -501,7 +501,7 @@
         <w:pStyle w:val="BodyText"/>
       </w:pPr>
       <w:r>
-        <w:t xml:space="preserve">[Speaker 0]</w:t>
+        <w:t xml:space="preserve">[Them]</w:t>
       </w:r>
       <w:r>
         <w:t xml:space="preserve"> </w:t>
@@ -515,7 +515,7 @@
         <w:pStyle w:val="BodyText"/>
       </w:pPr>
       <w:r>
-        <w:t xml:space="preserve">[Speaker 0]</w:t>
+        <w:t xml:space="preserve">[Them]</w:t>
       </w:r>
       <w:r>
         <w:t xml:space="preserve"> </w:t>
@@ -529,7 +529,7 @@
         <w:pStyle w:val="BodyText"/>
       </w:pPr>
       <w:r>
-        <w:t xml:space="preserve">[Speaker 0]</w:t>
+        <w:t xml:space="preserve">[Them]</w:t>
       </w:r>
       <w:r>
         <w:t xml:space="preserve"> </w:t>
@@ -543,7 +543,7 @@
         <w:pStyle w:val="BodyText"/>
       </w:pPr>
       <w:r>
-        <w:t xml:space="preserve">[Speaker 0]</w:t>
+        <w:t xml:space="preserve">[Them]</w:t>
       </w:r>
       <w:r>
         <w:t xml:space="preserve"> </w:t>
@@ -557,7 +557,7 @@
         <w:pStyle w:val="BodyText"/>
       </w:pPr>
       <w:r>
-        <w:t xml:space="preserve">[Speaker 0]</w:t>
+        <w:t xml:space="preserve">[Them]</w:t>
       </w:r>
       <w:r>
         <w:t xml:space="preserve"> </w:t>
@@ -571,7 +571,7 @@
         <w:pStyle w:val="BodyText"/>
       </w:pPr>
       <w:r>
-        <w:t xml:space="preserve">[Speaker 0]</w:t>
+        <w:t xml:space="preserve">[Them]</w:t>
       </w:r>
       <w:r>
         <w:t xml:space="preserve"> </w:t>
@@ -585,7 +585,7 @@
         <w:pStyle w:val="BodyText"/>
       </w:pPr>
       <w:r>
-        <w:t xml:space="preserve">[Speaker 0]</w:t>
+        <w:t xml:space="preserve">[Them]</w:t>
       </w:r>
       <w:r>
         <w:t xml:space="preserve"> </w:t>
@@ -599,7 +599,7 @@
         <w:pStyle w:val="BodyText"/>
       </w:pPr>
       <w:r>
-        <w:t xml:space="preserve">[Speaker 0]</w:t>
+        <w:t xml:space="preserve">[Them]</w:t>
       </w:r>
       <w:r>
         <w:t xml:space="preserve"> </w:t>
@@ -625,7 +625,7 @@
         <w:pStyle w:val="BodyText"/>
       </w:pPr>
       <w:r>
-        <w:t xml:space="preserve">[Speaker 0]</w:t>
+        <w:t xml:space="preserve">[Them]</w:t>
       </w:r>
       <w:r>
         <w:t xml:space="preserve"> </w:t>
@@ -639,7 +639,7 @@
         <w:pStyle w:val="BodyText"/>
       </w:pPr>
       <w:r>
-        <w:t xml:space="preserve">[Speaker 0]</w:t>
+        <w:t xml:space="preserve">[Them]</w:t>
       </w:r>
       <w:r>
         <w:t xml:space="preserve"> </w:t>
@@ -653,7 +653,7 @@
         <w:pStyle w:val="BodyText"/>
       </w:pPr>
       <w:r>
-        <w:t xml:space="preserve">[Speaker 0]</w:t>
+        <w:t xml:space="preserve">[Them]</w:t>
       </w:r>
       <w:r>
         <w:t xml:space="preserve"> </w:t>
@@ -667,7 +667,7 @@
         <w:pStyle w:val="BodyText"/>
       </w:pPr>
       <w:r>
-        <w:t xml:space="preserve">[Speaker 0]</w:t>
+        <w:t xml:space="preserve">[Them]</w:t>
       </w:r>
       <w:r>
         <w:t xml:space="preserve"> </w:t>
@@ -681,7 +681,7 @@
         <w:pStyle w:val="BodyText"/>
       </w:pPr>
       <w:r>
-        <w:t xml:space="preserve">[Speaker 0]</w:t>
+        <w:t xml:space="preserve">[Them]</w:t>
       </w:r>
       <w:r>
         <w:t xml:space="preserve"> </w:t>
@@ -695,7 +695,7 @@
         <w:pStyle w:val="BodyText"/>
       </w:pPr>
       <w:r>
-        <w:t xml:space="preserve">[Speaker 0]</w:t>
+        <w:t xml:space="preserve">[Them]</w:t>
       </w:r>
       <w:r>
         <w:t xml:space="preserve"> </w:t>
@@ -721,7 +721,7 @@
         <w:pStyle w:val="BodyText"/>
       </w:pPr>
       <w:r>
-        <w:t xml:space="preserve">[Speaker 0]</w:t>
+        <w:t xml:space="preserve">[Them]</w:t>
       </w:r>
       <w:r>
         <w:t xml:space="preserve"> </w:t>
@@ -735,7 +735,7 @@
         <w:pStyle w:val="BodyText"/>
       </w:pPr>
       <w:r>
-        <w:t xml:space="preserve">[Speaker 0]</w:t>
+        <w:t xml:space="preserve">[Them]</w:t>
       </w:r>
       <w:r>
         <w:t xml:space="preserve"> </w:t>
@@ -749,7 +749,7 @@
         <w:pStyle w:val="BodyText"/>
       </w:pPr>
       <w:r>
-        <w:t xml:space="preserve">[Speaker 0]</w:t>
+        <w:t xml:space="preserve">[Them]</w:t>
       </w:r>
       <w:r>
         <w:t xml:space="preserve"> </w:t>
@@ -775,7 +775,7 @@
         <w:pStyle w:val="BodyText"/>
       </w:pPr>
       <w:r>
-        <w:t xml:space="preserve">[Speaker 0]</w:t>
+        <w:t xml:space="preserve">[Them]</w:t>
       </w:r>
       <w:r>
         <w:t xml:space="preserve"> </w:t>
@@ -789,7 +789,7 @@
         <w:pStyle w:val="BodyText"/>
       </w:pPr>
       <w:r>
-        <w:t xml:space="preserve">[Speaker 0]</w:t>
+        <w:t xml:space="preserve">[Them]</w:t>
       </w:r>
       <w:r>
         <w:t xml:space="preserve"> </w:t>
@@ -803,7 +803,7 @@
         <w:pStyle w:val="BodyText"/>
       </w:pPr>
       <w:r>
-        <w:t xml:space="preserve">[Speaker 0]</w:t>
+        <w:t xml:space="preserve">[Them]</w:t>
       </w:r>
       <w:r>
         <w:t xml:space="preserve"> </w:t>
@@ -817,7 +817,7 @@
         <w:pStyle w:val="BodyText"/>
       </w:pPr>
       <w:r>
-        <w:t xml:space="preserve">[Speaker 0]</w:t>
+        <w:t xml:space="preserve">[Them]</w:t>
       </w:r>
       <w:r>
         <w:t xml:space="preserve"> </w:t>
@@ -843,7 +843,7 @@
         <w:pStyle w:val="BodyText"/>
       </w:pPr>
       <w:r>
-        <w:t xml:space="preserve">[Speaker 0]</w:t>
+        <w:t xml:space="preserve">[Them]</w:t>
       </w:r>
       <w:r>
         <w:t xml:space="preserve"> </w:t>
@@ -869,7 +869,7 @@
         <w:pStyle w:val="BodyText"/>
       </w:pPr>
       <w:r>
-        <w:t xml:space="preserve">[Speaker 0]</w:t>
+        <w:t xml:space="preserve">[Them]</w:t>
       </w:r>
       <w:r>
         <w:t xml:space="preserve"> </w:t>
@@ -919,7 +919,7 @@
         <w:pStyle w:val="BodyText"/>
       </w:pPr>
       <w:r>
-        <w:t xml:space="preserve">[Speaker 0]</w:t>
+        <w:t xml:space="preserve">[Them]</w:t>
       </w:r>
       <w:r>
         <w:t xml:space="preserve"> </w:t>
@@ -933,7 +933,7 @@
         <w:pStyle w:val="BodyText"/>
       </w:pPr>
       <w:r>
-        <w:t xml:space="preserve">[Speaker 0]</w:t>
+        <w:t xml:space="preserve">[Them]</w:t>
       </w:r>
       <w:r>
         <w:t xml:space="preserve"> </w:t>
@@ -947,7 +947,7 @@
         <w:pStyle w:val="BodyText"/>
       </w:pPr>
       <w:r>
-        <w:t xml:space="preserve">[Speaker 0]</w:t>
+        <w:t xml:space="preserve">[Them]</w:t>
       </w:r>
       <w:r>
         <w:t xml:space="preserve"> </w:t>
@@ -961,7 +961,7 @@
         <w:pStyle w:val="BodyText"/>
       </w:pPr>
       <w:r>
-        <w:t xml:space="preserve">[Speaker 0]</w:t>
+        <w:t xml:space="preserve">[Them]</w:t>
       </w:r>
       <w:r>
         <w:t xml:space="preserve"> </w:t>
@@ -987,7 +987,7 @@
         <w:pStyle w:val="BodyText"/>
       </w:pPr>
       <w:r>
-        <w:t xml:space="preserve">[Speaker 0]</w:t>
+        <w:t xml:space="preserve">[Them]</w:t>
       </w:r>
       <w:r>
         <w:t xml:space="preserve"> </w:t>
@@ -1037,7 +1037,7 @@
         <w:pStyle w:val="BodyText"/>
       </w:pPr>
       <w:r>
-        <w:t xml:space="preserve">[Speaker 0]</w:t>
+        <w:t xml:space="preserve">[Them]</w:t>
       </w:r>
       <w:r>
         <w:t xml:space="preserve"> </w:t>
@@ -1051,7 +1051,7 @@
         <w:pStyle w:val="BodyText"/>
       </w:pPr>
       <w:r>
-        <w:t xml:space="preserve">[Speaker 0]</w:t>
+        <w:t xml:space="preserve">[Them]</w:t>
       </w:r>
       <w:r>
         <w:t xml:space="preserve"> </w:t>
@@ -1065,7 +1065,7 @@
         <w:pStyle w:val="BodyText"/>
       </w:pPr>
       <w:r>
-        <w:t xml:space="preserve">[Speaker 0]</w:t>
+        <w:t xml:space="preserve">[Them]</w:t>
       </w:r>
       <w:r>
         <w:t xml:space="preserve"> </w:t>
@@ -1091,7 +1091,7 @@
         <w:pStyle w:val="BodyText"/>
       </w:pPr>
       <w:r>
-        <w:t xml:space="preserve">[Speaker 0]</w:t>
+        <w:t xml:space="preserve">[Them]</w:t>
       </w:r>
       <w:r>
         <w:t xml:space="preserve"> </w:t>
@@ -1105,7 +1105,7 @@
         <w:pStyle w:val="BodyText"/>
       </w:pPr>
       <w:r>
-        <w:t xml:space="preserve">[Speaker 0]</w:t>
+        <w:t xml:space="preserve">[Them]</w:t>
       </w:r>
       <w:r>
         <w:t xml:space="preserve"> </w:t>
@@ -1119,7 +1119,7 @@
         <w:pStyle w:val="BodyText"/>
       </w:pPr>
       <w:r>
-        <w:t xml:space="preserve">[Speaker 0]</w:t>
+        <w:t xml:space="preserve">[Them]</w:t>
       </w:r>
       <w:r>
         <w:t xml:space="preserve"> </w:t>
@@ -1157,7 +1157,7 @@
         <w:pStyle w:val="BodyText"/>
       </w:pPr>
       <w:r>
-        <w:t xml:space="preserve">[Speaker 0]</w:t>
+        <w:t xml:space="preserve">[Them]</w:t>
       </w:r>
       <w:r>
         <w:t xml:space="preserve"> </w:t>
@@ -1171,7 +1171,7 @@
         <w:pStyle w:val="BodyText"/>
       </w:pPr>
       <w:r>
-        <w:t xml:space="preserve">[Speaker 0]</w:t>
+        <w:t xml:space="preserve">[Them]</w:t>
       </w:r>
       <w:r>
         <w:t xml:space="preserve"> </w:t>
@@ -1185,7 +1185,7 @@
         <w:pStyle w:val="BodyText"/>
       </w:pPr>
       <w:r>
-        <w:t xml:space="preserve">[Speaker 0]</w:t>
+        <w:t xml:space="preserve">[Them]</w:t>
       </w:r>
       <w:r>
         <w:t xml:space="preserve"> </w:t>
@@ -1199,21 +1199,21 @@
         <w:pStyle w:val="BodyText"/>
       </w:pPr>
       <w:r>
-        <w:t xml:space="preserve">[Speaker 0]</w:t>
-      </w:r>
-      <w:r>
-        <w:t xml:space="preserve"> </w:t>
-      </w:r>
-      <w:r>
-        <w:t xml:space="preserve">yeah, maybe ask Berfune about it. She might tell you. [chuckles]</w:t>
-      </w:r>
-    </w:p>
-    <w:p>
-      <w:pPr>
-        <w:pStyle w:val="BodyText"/>
-      </w:pPr>
-      <w:r>
-        <w:t xml:space="preserve">[Speaker 0]</w:t>
+        <w:t xml:space="preserve">[Them]</w:t>
+      </w:r>
+      <w:r>
+        <w:t xml:space="preserve"> </w:t>
+      </w:r>
+      <w:r>
+        <w:t xml:space="preserve">yeah, maybe ask Berfun about it. She might tell you. [chuckles]</w:t>
+      </w:r>
+    </w:p>
+    <w:p>
+      <w:pPr>
+        <w:pStyle w:val="BodyText"/>
+      </w:pPr>
+      <w:r>
+        <w:t xml:space="preserve">[Them]</w:t>
       </w:r>
       <w:r>
         <w:t xml:space="preserve"> </w:t>
@@ -1251,7 +1251,7 @@
         <w:pStyle w:val="BodyText"/>
       </w:pPr>
       <w:r>
-        <w:t xml:space="preserve">[Speaker 0]</w:t>
+        <w:t xml:space="preserve">[Them]</w:t>
       </w:r>
       <w:r>
         <w:t xml:space="preserve"> </w:t>
@@ -1265,7 +1265,7 @@
         <w:pStyle w:val="BodyText"/>
       </w:pPr>
       <w:r>
-        <w:t xml:space="preserve">[Speaker 0]</w:t>
+        <w:t xml:space="preserve">[Them]</w:t>
       </w:r>
       <w:r>
         <w:t xml:space="preserve"> </w:t>
@@ -1279,7 +1279,7 @@
         <w:pStyle w:val="BodyText"/>
       </w:pPr>
       <w:r>
-        <w:t xml:space="preserve">[Speaker 0]</w:t>
+        <w:t xml:space="preserve">[Them]</w:t>
       </w:r>
       <w:r>
         <w:t xml:space="preserve"> </w:t>
@@ -1305,7 +1305,7 @@
         <w:pStyle w:val="BodyText"/>
       </w:pPr>
       <w:r>
-        <w:t xml:space="preserve">[Speaker 0]</w:t>
+        <w:t xml:space="preserve">[Them]</w:t>
       </w:r>
       <w:r>
         <w:t xml:space="preserve"> </w:t>
@@ -1331,7 +1331,7 @@
         <w:pStyle w:val="BodyText"/>
       </w:pPr>
       <w:r>
-        <w:t xml:space="preserve">[Speaker 0]</w:t>
+        <w:t xml:space="preserve">[Them]</w:t>
       </w:r>
       <w:r>
         <w:t xml:space="preserve"> </w:t>
@@ -1345,7 +1345,7 @@
         <w:pStyle w:val="BodyText"/>
       </w:pPr>
       <w:r>
-        <w:t xml:space="preserve">[Speaker 0]</w:t>
+        <w:t xml:space="preserve">[Them]</w:t>
       </w:r>
       <w:r>
         <w:t xml:space="preserve"> </w:t>
@@ -1371,7 +1371,7 @@
         <w:pStyle w:val="BodyText"/>
       </w:pPr>
       <w:r>
-        <w:t xml:space="preserve">[Speaker 0]</w:t>
+        <w:t xml:space="preserve">[Them]</w:t>
       </w:r>
       <w:r>
         <w:t xml:space="preserve"> </w:t>
@@ -1385,7 +1385,7 @@
         <w:pStyle w:val="BodyText"/>
       </w:pPr>
       <w:r>
-        <w:t xml:space="preserve">[Speaker 0]</w:t>
+        <w:t xml:space="preserve">[Them]</w:t>
       </w:r>
       <w:r>
         <w:t xml:space="preserve"> </w:t>
@@ -1399,7 +1399,7 @@
         <w:pStyle w:val="BodyText"/>
       </w:pPr>
       <w:r>
-        <w:t xml:space="preserve">[Speaker 0]</w:t>
+        <w:t xml:space="preserve">[Them]</w:t>
       </w:r>
       <w:r>
         <w:t xml:space="preserve"> </w:t>
@@ -1429,7 +1429,7 @@
         <w:t xml:space="preserve"> </w:t>
       </w:r>
       <w:r>
-        <w:t xml:space="preserve">But sometimes you need that. So I take my sentence, I put it in ChaGPT, and I tell it:</w:t>
+        <w:t xml:space="preserve">But sometimes you need that. So I take my sentence, I put it in ChatGPT, and I tell it:</w:t>
       </w:r>
       <w:r>
         <w:t xml:space="preserve"> </w:t>
@@ -1449,7 +1449,7 @@
         <w:pStyle w:val="BodyText"/>
       </w:pPr>
       <w:r>
-        <w:t xml:space="preserve">[Speaker 0]</w:t>
+        <w:t xml:space="preserve">[Them]</w:t>
       </w:r>
       <w:r>
         <w:t xml:space="preserve"> </w:t>
@@ -1487,7 +1487,7 @@
         <w:pStyle w:val="BodyText"/>
       </w:pPr>
       <w:r>
-        <w:t xml:space="preserve">[Speaker 0]</w:t>
+        <w:t xml:space="preserve">[Them]</w:t>
       </w:r>
       <w:r>
         <w:t xml:space="preserve"> </w:t>
@@ -1501,7 +1501,7 @@
         <w:pStyle w:val="BodyText"/>
       </w:pPr>
       <w:r>
-        <w:t xml:space="preserve">[Speaker 0]</w:t>
+        <w:t xml:space="preserve">[Them]</w:t>
       </w:r>
       <w:r>
         <w:t xml:space="preserve"> </w:t>
@@ -1515,7 +1515,7 @@
         <w:pStyle w:val="BodyText"/>
       </w:pPr>
       <w:r>
-        <w:t xml:space="preserve">[Speaker 0]</w:t>
+        <w:t xml:space="preserve">[Them]</w:t>
       </w:r>
       <w:r>
         <w:t xml:space="preserve"> </w:t>
@@ -1529,7 +1529,7 @@
         <w:pStyle w:val="BodyText"/>
       </w:pPr>
       <w:r>
-        <w:t xml:space="preserve">[Speaker 0]</w:t>
+        <w:t xml:space="preserve">[Them]</w:t>
       </w:r>
       <w:r>
         <w:t xml:space="preserve"> </w:t>
@@ -1555,7 +1555,7 @@
         <w:pStyle w:val="BodyText"/>
       </w:pPr>
       <w:r>
-        <w:t xml:space="preserve">[Speaker 0]</w:t>
+        <w:t xml:space="preserve">[Them]</w:t>
       </w:r>
       <w:r>
         <w:t xml:space="preserve"> </w:t>
@@ -1569,7 +1569,7 @@
         <w:pStyle w:val="BodyText"/>
       </w:pPr>
       <w:r>
-        <w:t xml:space="preserve">[Speaker 0]</w:t>
+        <w:t xml:space="preserve">[Them]</w:t>
       </w:r>
       <w:r>
         <w:t xml:space="preserve"> </w:t>
@@ -1583,7 +1583,7 @@
         <w:pStyle w:val="BodyText"/>
       </w:pPr>
       <w:r>
-        <w:t xml:space="preserve">[Speaker 0]</w:t>
+        <w:t xml:space="preserve">[Them]</w:t>
       </w:r>
       <w:r>
         <w:t xml:space="preserve"> </w:t>
@@ -1597,7 +1597,7 @@
         <w:pStyle w:val="BodyText"/>
       </w:pPr>
       <w:r>
-        <w:t xml:space="preserve">[Speaker 0]</w:t>
+        <w:t xml:space="preserve">[Them]</w:t>
       </w:r>
       <w:r>
         <w:t xml:space="preserve"> </w:t>
@@ -1611,7 +1611,7 @@
         <w:pStyle w:val="BodyText"/>
       </w:pPr>
       <w:r>
-        <w:t xml:space="preserve">[Speaker 0]</w:t>
+        <w:t xml:space="preserve">[Them]</w:t>
       </w:r>
       <w:r>
         <w:t xml:space="preserve"> </w:t>
@@ -1625,7 +1625,7 @@
         <w:pStyle w:val="BodyText"/>
       </w:pPr>
       <w:r>
-        <w:t xml:space="preserve">[Speaker 0]</w:t>
+        <w:t xml:space="preserve">[Them]</w:t>
       </w:r>
       <w:r>
         <w:t xml:space="preserve"> </w:t>
@@ -1639,7 +1639,7 @@
         <w:pStyle w:val="BodyText"/>
       </w:pPr>
       <w:r>
-        <w:t xml:space="preserve">[Speaker 0]</w:t>
+        <w:t xml:space="preserve">[Them]</w:t>
       </w:r>
       <w:r>
         <w:t xml:space="preserve"> </w:t>
@@ -1653,7 +1653,7 @@
         <w:pStyle w:val="BodyText"/>
       </w:pPr>
       <w:r>
-        <w:t xml:space="preserve">[Speaker 0]</w:t>
+        <w:t xml:space="preserve">[Them]</w:t>
       </w:r>
       <w:r>
         <w:t xml:space="preserve"> </w:t>
@@ -1664,7 +1664,7 @@
     </w:p>
     <w:p>
       <w:pPr>
-        <w:pStyle w:val="BodyText"/>
+        <w:pStyle w:val="BlockText"/>
       </w:pPr>
       <w:r>
         <w:t xml:space="preserve">[Me]</w:t>
@@ -1678,7 +1678,7 @@
     </w:p>
     <w:p>
       <w:pPr>
-        <w:pStyle w:val="BodyText"/>
+        <w:pStyle w:val="FirstParagraph"/>
       </w:pPr>
       <w:r>
         <w:t xml:space="preserve">[Them]</w:t>
@@ -1692,7 +1692,7 @@
     </w:p>
     <w:p>
       <w:pPr>
-        <w:pStyle w:val="BodyText"/>
+        <w:pStyle w:val="BlockText"/>
       </w:pPr>
       <w:r>
         <w:t xml:space="preserve">[Me]</w:t>
@@ -1706,21 +1706,21 @@
     </w:p>
     <w:p>
       <w:pPr>
-        <w:pStyle w:val="BodyText"/>
-      </w:pPr>
-      <w:r>
-        <w:t xml:space="preserve">[Them]</w:t>
-      </w:r>
-      <w:r>
-        <w:t xml:space="preserve"> </w:t>
-      </w:r>
-      <w:r>
-        <w:t xml:space="preserve">Yeah. I’ll send, I’ll send out an email to Skip Johnston to introduce you to, and, hopefully, he’ll set up time. He’s pretty bussy, so I don’t know. No promises. But, him and I, we’ve worked together on projects before, so he’ll probably be for it.</w:t>
-      </w:r>
-    </w:p>
-    <w:p>
-      <w:pPr>
-        <w:pStyle w:val="BodyText"/>
+        <w:pStyle w:val="FirstParagraph"/>
+      </w:pPr>
+      <w:r>
+        <w:t xml:space="preserve">[Them]</w:t>
+      </w:r>
+      <w:r>
+        <w:t xml:space="preserve"> </w:t>
+      </w:r>
+      <w:r>
+        <w:t xml:space="preserve">Yeah. I’ll send, I’ll send out an email to Skip Johnston to introduce you to, and, hopefully, he’ll set up time. He’s pretty busy, so I don’t know. No promises. But, him and I, we’ve worked together on projects before, so he’ll probably be for it.</w:t>
+      </w:r>
+    </w:p>
+    <w:p>
+      <w:pPr>
+        <w:pStyle w:val="BlockText"/>
       </w:pPr>
       <w:r>
         <w:t xml:space="preserve">[Me]</w:t>
@@ -1734,7 +1734,7 @@
     </w:p>
     <w:p>
       <w:pPr>
-        <w:pStyle w:val="BodyText"/>
+        <w:pStyle w:val="FirstParagraph"/>
       </w:pPr>
       <w:r>
         <w:t xml:space="preserve">[Them]</w:t>
@@ -1748,7 +1748,7 @@
     </w:p>
     <w:p>
       <w:pPr>
-        <w:pStyle w:val="BodyText"/>
+        <w:pStyle w:val="BlockText"/>
       </w:pPr>
       <w:r>
         <w:t xml:space="preserve">[Me]</w:t>
@@ -1762,7 +1762,7 @@
     </w:p>
     <w:p>
       <w:pPr>
-        <w:pStyle w:val="BodyText"/>
+        <w:pStyle w:val="FirstParagraph"/>
       </w:pPr>
       <w:r>
         <w:t xml:space="preserve">[Them]</w:t>
@@ -1776,7 +1776,7 @@
     </w:p>
     <w:p>
       <w:pPr>
-        <w:pStyle w:val="BodyText"/>
+        <w:pStyle w:val="BlockText"/>
       </w:pPr>
       <w:r>
         <w:t xml:space="preserve">[Me]</w:t>

</xml_diff>